<commit_message>
feat(prospection): viser tout le stock des la premiere visite
Nous ne sommes pas encore en activite : la phase actuelle est un
recensement des vendeurs professionnels. L'objectif d'engagement en
visite passe donc de « dix references pour l'ouverture » a « tout le
stock des le premier passage » ; l'echantillon devient un repli.

- guide-prospection : accroche 4.1, relance 6.4, objection 6.6,
  contexte de prelancement + table des niveaux 7, fiche 8, suivi 9
- manuel liaison : mission d'onboarding + bonne pratique de recensement
- PROSPECTION_SCRIPT : question de cloture et accroche alignees
  (ids inchanges)
- DOCX/PDF regeneres

Co-Authored-By: Claude Opus 5 <noreply@anthropic.com>
</commit_message>
<xml_diff>
--- a/docs/deep-dive-manuel-liaison.docx
+++ b/docs/deep-dive-manuel-liaison.docx
@@ -409,7 +409,23 @@
         <w:t xml:space="preserve"> </w:t>
       </w:r>
       <w:r>
-        <w:t xml:space="preserve">les vendeurs sur la plateforme Pièces : créer leur compte, saisir leur KYC, prendre la photo des premières pièces, fixer une commission agréée pour chaque article.</w:t>
+        <w:t xml:space="preserve">les vendeurs sur la plateforme Pièces : créer leur compte, saisir leur KYC,</w:t>
+      </w:r>
+      <w:r>
+        <w:t xml:space="preserve"> </w:t>
+      </w:r>
+      <w:r>
+        <w:rPr>
+          <w:b/>
+          <w:bCs/>
+        </w:rPr>
+        <w:t xml:space="preserve">recenser tout le stock</w:t>
+      </w:r>
+      <w:r>
+        <w:t xml:space="preserve"> </w:t>
+      </w:r>
+      <w:r>
+        <w:t xml:space="preserve">(photo et description, rayon par rayon — pas un échantillon), fixer une commission agréée pour chaque article.</w:t>
       </w:r>
     </w:p>
     <w:p>
@@ -3500,6 +3516,28 @@
       </w:r>
       <w:r>
         <w:t xml:space="preserve">à l’onboarding initial — une fiche sans photo se vend mal.</w:t>
+      </w:r>
+    </w:p>
+    <w:p>
+      <w:pPr>
+        <w:pStyle w:val="Compact"/>
+        <w:numPr>
+          <w:ilvl w:val="0"/>
+          <w:numId w:val="1020"/>
+        </w:numPr>
+      </w:pPr>
+      <w:r>
+        <w:rPr>
+          <w:b/>
+          <w:bCs/>
+        </w:rPr>
+        <w:t xml:space="preserve">Prendre tout le stock au premier passage</w:t>
+      </w:r>
+      <w:r>
+        <w:t xml:space="preserve"> </w:t>
+      </w:r>
+      <w:r>
+        <w:t xml:space="preserve">— nous sommes en phase de recensement avant l’ouverture : ce qui n’est pas photographié ce jour-là n’existera pas au lancement. Si le magasin est trop grand pour une demi-journée, on repasse jusqu’à l’avoir fini plutôt que de s’arrêter à un échantillon.</w:t>
       </w:r>
     </w:p>
     <w:p>

</xml_diff>